<commit_message>
Milestone 5 ALG 1.13.1 getResumeSubmissions() slight revision
</commit_message>
<xml_diff>
--- a/04_QA_Review/Pending_Review/DS_M5_Team5_ALG_1.13.1_getResumeSubmissions().docx
+++ b/04_QA_Review/Pending_Review/DS_M5_Team5_ALG_1.13.1_getResumeSubmissions().docx
@@ -85,10 +85,10 @@
       </w:pPr>
       <w:r>
         <w:drawing>
-          <wp:inline distT="0" distB="0" distL="0" distR="0" wp14:anchorId="728EAEE1" wp14:editId="0A7F11A4">
+          <wp:inline distT="0" distB="0" distL="0" distR="0" wp14:anchorId="76E89098" wp14:editId="25E1A87B">
             <wp:extent cx="5943600" cy="5074285"/>
             <wp:effectExtent l="0" t="0" r="0" b="0"/>
-            <wp:docPr id="1977291225" name="Picture 1"/>
+            <wp:docPr id="750860205" name="Picture 2"/>
             <wp:cNvGraphicFramePr>
               <a:graphicFrameLocks xmlns:a="http://schemas.openxmlformats.org/drawingml/2006/main" noChangeAspect="1"/>
             </wp:cNvGraphicFramePr>
@@ -96,7 +96,7 @@
               <a:graphicData uri="http://schemas.openxmlformats.org/drawingml/2006/picture">
                 <pic:pic xmlns:pic="http://schemas.openxmlformats.org/drawingml/2006/picture">
                   <pic:nvPicPr>
-                    <pic:cNvPr id="1977291225" name="Picture 1977291225"/>
+                    <pic:cNvPr id="750860205" name="Picture 750860205"/>
                     <pic:cNvPicPr/>
                   </pic:nvPicPr>
                   <pic:blipFill>
@@ -1376,6 +1376,7 @@
   <w:style w:type="character" w:default="1" w:styleId="DefaultParagraphFont">
     <w:name w:val="Default Paragraph Font"/>
     <w:uiPriority w:val="1"/>
+    <w:semiHidden/>
     <w:unhideWhenUsed/>
   </w:style>
   <w:style w:type="table" w:default="1" w:styleId="TableNormal">

</xml_diff>